<commit_message>
feat: enhance header formatting in generated DOCX to prevent logo collision and improve font scaling
</commit_message>
<xml_diff>
--- a/src/templates/tecnics_resume_template.docx
+++ b/src/templates/tecnics_resume_template.docx
@@ -85,8 +85,8 @@
       <w:rPr>
         <w:rFonts w:asciiTheme="minorHAnsi" w:eastAsia="Times New Roman" w:hAnsiTheme="minorHAnsi" w:cstheme="minorHAnsi"/>
         <w:b/>
-        <w:sz w:val="44"/>
-        <w:szCs w:val="44"/>
+        <w:sz w:val="36"/>
+        <w:szCs w:val="36"/>
       </w:rPr>
     </w:pPr>
     <w:r>
@@ -94,8 +94,8 @@
         <w:rFonts w:asciiTheme="minorHAnsi" w:hAnsiTheme="minorHAnsi" w:cstheme="minorHAnsi"/>
         <w:b/>
         <w:noProof/>
-        <w:sz w:val="44"/>
-        <w:szCs w:val="44"/>
+        <w:sz w:val="36"/>
+        <w:szCs w:val="36"/>
         <w:lang w:val="en-IN" w:eastAsia="en-IN"/>
       </w:rPr>
       <w:drawing>
@@ -109,19 +109,7 @@
           </wp:positionV>
           <wp:extent cx="2381250" cy="387985"/>
           <wp:effectExtent l="0" t="0" r="0" b="0"/>
-          <wp:wrapTight wrapText="bothSides">
-            <wp:wrapPolygon edited="0">
-              <wp:start x="14170" y="0"/>
-              <wp:lineTo x="0" y="4242"/>
-              <wp:lineTo x="0" y="10606"/>
-              <wp:lineTo x="691" y="16969"/>
-              <wp:lineTo x="691" y="20151"/>
-              <wp:lineTo x="21427" y="20151"/>
-              <wp:lineTo x="21427" y="4242"/>
-              <wp:lineTo x="15898" y="0"/>
-              <wp:lineTo x="14170" y="0"/>
-            </wp:wrapPolygon>
-          </wp:wrapTight>
+          <wp:wrapNone/>
           <wp:docPr id="1" name="Picture 2"/>
           <wp:cNvGraphicFramePr>
             <a:graphicFrameLocks xmlns:a="http://schemas.openxmlformats.org/drawingml/2006/main" noChangeAspect="1"/>
@@ -182,8 +170,8 @@
         <w:rFonts w:asciiTheme="minorHAnsi" w:hAnsiTheme="minorHAnsi" w:cstheme="minorHAnsi"/>
         <w:b/>
         <w:noProof/>
-        <w:sz w:val="44"/>
-        <w:szCs w:val="44"/>
+        <w:sz w:val="36"/>
+        <w:szCs w:val="36"/>
         <w:lang w:val="en-IN" w:eastAsia="en-IN"/>
       </w:rPr>
       <mc:AlternateContent>
@@ -264,20 +252,11 @@
         <w:rFonts w:asciiTheme="minorHAnsi" w:hAnsiTheme="minorHAnsi" w:cstheme="minorHAnsi"/>
         <w:b/>
         <w:noProof/>
-        <w:sz w:val="44"/>
-        <w:szCs w:val="44"/>
+        <w:sz w:val="36"/>
+        <w:szCs w:val="36"/>
         <w:lang w:val="en-IN" w:eastAsia="en-IN"/>
       </w:rPr>
       <w:t>{{ candidate_name }}</w:t>
-    </w:r>
-    <w:r>
-      <w:rPr>
-        <w:rFonts w:asciiTheme="minorHAnsi" w:hAnsiTheme="minorHAnsi" w:cstheme="minorHAnsi"/>
-        <w:b/>
-        <w:sz w:val="44"/>
-        <w:szCs w:val="44"/>
-      </w:rPr>
-      <w:tab/>
     </w:r>
   </w:p>
 </w:hdr>

</xml_diff>